<commit_message>
feat(offers): manage product categories in Produkte admin
Category field in the product editor now shows clickable chips of the
existing categories in the selected catalog (reuse existing, or type a
new one), and each product row displays its category. Assigning a
consistent category is what groups products correctly within their
hardcoded catalog in the builder (TabContent groups by `cat`).

Adds ProductsAdminPage.test.tsx.

Co-Authored-By: Claude Opus 4.8 (1M context) <noreply@anthropic.com>
Claude-Session: https://claude.ai/code/session_017VY5wUAXsxkWKKBW5CnJYQ
</commit_message>
<xml_diff>
--- a/docs/Mesonic_WebServices_Anforderungen.docx
+++ b/docs/Mesonic_WebServices_Anforderungen.docx
@@ -1248,7 +1248,7 @@
                 <w:sz w:val="20"/>
                 <w:szCs w:val="20"/>
               </w:rPr>
-              <w:t xml:space="preserve">Kontaktpersonen lesen</w:t>
+              <w:t xml:space="preserve">Ansprechpartner lesen</w:t>
             </w:r>
           </w:p>
         </w:tc>
@@ -1277,6 +1277,151 @@
                 <w:szCs w:val="20"/>
               </w:rPr>
               <w:t xml:space="preserve">Export</w:t>
+            </w:r>
+          </w:p>
+        </w:tc>
+        <w:tc>
+          <w:tcPr>
+            <w:tcW w:type="dxa" w:w="2412"/>
+            <w:tcBorders>
+              <w:top w:val="single" w:color="CCCCCC" w:sz="1"/>
+              <w:left w:val="single" w:color="CCCCCC" w:sz="1"/>
+              <w:bottom w:val="single" w:color="CCCCCC" w:sz="1"/>
+              <w:right w:val="single" w:color="CCCCCC" w:sz="1"/>
+            </w:tcBorders>
+            <w:shd w:fill="FADBD8" w:val="clear"/>
+            <w:tcMar>
+              <w:top w:type="dxa" w:w="60"/>
+              <w:left w:type="dxa" w:w="100"/>
+              <w:bottom w:type="dxa" w:w="60"/>
+              <w:right w:type="dxa" w:w="100"/>
+            </w:tcMar>
+          </w:tcPr>
+          <w:p>
+            <w:r>
+              <w:rPr>
+                <w:rFonts w:ascii="Arial" w:cs="Arial" w:eastAsia="Arial" w:hAnsi="Arial"/>
+                <w:color w:val="C0392B"/>
+                <w:sz w:val="20"/>
+                <w:szCs w:val="20"/>
+              </w:rPr>
+              <w:t xml:space="preserve">fehlt</w:t>
+            </w:r>
+          </w:p>
+        </w:tc>
+      </w:tr>
+      <w:tr>
+        <w:tc>
+          <w:tcPr>
+            <w:tcW w:type="dxa" w:w="963"/>
+            <w:tcBorders>
+              <w:top w:val="single" w:color="CCCCCC" w:sz="1"/>
+              <w:left w:val="single" w:color="CCCCCC" w:sz="1"/>
+              <w:bottom w:val="single" w:color="CCCCCC" w:sz="1"/>
+              <w:right w:val="single" w:color="CCCCCC" w:sz="1"/>
+            </w:tcBorders>
+            <w:tcMar>
+              <w:top w:type="dxa" w:w="60"/>
+              <w:left w:type="dxa" w:w="100"/>
+              <w:bottom w:type="dxa" w:w="60"/>
+              <w:right w:type="dxa" w:w="100"/>
+            </w:tcMar>
+          </w:tcPr>
+          <w:p>
+            <w:r>
+              <w:rPr>
+                <w:rFonts w:ascii="Arial" w:cs="Arial" w:eastAsia="Arial" w:hAnsi="Arial"/>
+                <w:b/>
+                <w:bCs/>
+                <w:color w:val="333333"/>
+                <w:sz w:val="20"/>
+                <w:szCs w:val="20"/>
+              </w:rPr>
+              <w:t xml:space="preserve">7</w:t>
+            </w:r>
+          </w:p>
+        </w:tc>
+        <w:tc>
+          <w:tcPr>
+            <w:tcW w:type="dxa" w:w="2409"/>
+            <w:tcBorders>
+              <w:top w:val="single" w:color="CCCCCC" w:sz="1"/>
+              <w:left w:val="single" w:color="CCCCCC" w:sz="1"/>
+              <w:bottom w:val="single" w:color="CCCCCC" w:sz="1"/>
+              <w:right w:val="single" w:color="CCCCCC" w:sz="1"/>
+            </w:tcBorders>
+            <w:tcMar>
+              <w:top w:type="dxa" w:w="60"/>
+              <w:left w:type="dxa" w:w="100"/>
+              <w:bottom w:type="dxa" w:w="60"/>
+              <w:right w:type="dxa" w:w="100"/>
+            </w:tcMar>
+          </w:tcPr>
+          <w:p>
+            <w:r>
+              <w:rPr>
+                <w:rFonts w:ascii="Arial" w:cs="Arial" w:eastAsia="Arial" w:hAnsi="Arial"/>
+                <w:color w:val="333333"/>
+                <w:sz w:val="20"/>
+                <w:szCs w:val="20"/>
+              </w:rPr>
+              <w:t xml:space="preserve">WebKontakteImport</w:t>
+            </w:r>
+          </w:p>
+        </w:tc>
+        <w:tc>
+          <w:tcPr>
+            <w:tcW w:type="dxa" w:w="2409"/>
+            <w:tcBorders>
+              <w:top w:val="single" w:color="CCCCCC" w:sz="1"/>
+              <w:left w:val="single" w:color="CCCCCC" w:sz="1"/>
+              <w:bottom w:val="single" w:color="CCCCCC" w:sz="1"/>
+              <w:right w:val="single" w:color="CCCCCC" w:sz="1"/>
+            </w:tcBorders>
+            <w:tcMar>
+              <w:top w:type="dxa" w:w="60"/>
+              <w:left w:type="dxa" w:w="100"/>
+              <w:bottom w:type="dxa" w:w="60"/>
+              <w:right w:type="dxa" w:w="100"/>
+            </w:tcMar>
+          </w:tcPr>
+          <w:p>
+            <w:r>
+              <w:rPr>
+                <w:rFonts w:ascii="Arial" w:cs="Arial" w:eastAsia="Arial" w:hAnsi="Arial"/>
+                <w:color w:val="333333"/>
+                <w:sz w:val="20"/>
+                <w:szCs w:val="20"/>
+              </w:rPr>
+              <w:t xml:space="preserve">Ansprechpartner anlegen</w:t>
+            </w:r>
+          </w:p>
+        </w:tc>
+        <w:tc>
+          <w:tcPr>
+            <w:tcW w:type="dxa" w:w="1445"/>
+            <w:tcBorders>
+              <w:top w:val="single" w:color="CCCCCC" w:sz="1"/>
+              <w:left w:val="single" w:color="CCCCCC" w:sz="1"/>
+              <w:bottom w:val="single" w:color="CCCCCC" w:sz="1"/>
+              <w:right w:val="single" w:color="CCCCCC" w:sz="1"/>
+            </w:tcBorders>
+            <w:tcMar>
+              <w:top w:type="dxa" w:w="60"/>
+              <w:left w:type="dxa" w:w="100"/>
+              <w:bottom w:type="dxa" w:w="60"/>
+              <w:right w:type="dxa" w:w="100"/>
+            </w:tcMar>
+          </w:tcPr>
+          <w:p>
+            <w:r>
+              <w:rPr>
+                <w:rFonts w:ascii="Arial" w:cs="Arial" w:eastAsia="Arial" w:hAnsi="Arial"/>
+                <w:color w:val="333333"/>
+                <w:sz w:val="20"/>
+                <w:szCs w:val="20"/>
+              </w:rPr>
+              <w:t xml:space="preserve">Import</w:t>
             </w:r>
           </w:p>
         </w:tc>
@@ -3894,24 +4039,6 @@
           <w:sz w:val="20"/>
           <w:szCs w:val="20"/>
         </w:rPr>
-        <w:t xml:space="preserve">Ansprechpartner (Kontaktperson)</w:t>
-      </w:r>
-    </w:p>
-    <w:p>
-      <w:pPr>
-        <w:pStyle w:val="ListParagraph"/>
-        <w:numPr>
-          <w:ilvl w:val="0"/>
-          <w:numId w:val="2"/>
-        </w:numPr>
-        <w:spacing w:after="60"/>
-      </w:pPr>
-      <w:r>
-        <w:rPr>
-          <w:rFonts w:ascii="Arial" w:cs="Arial" w:eastAsia="Arial" w:hAnsi="Arial"/>
-          <w:sz w:val="20"/>
-          <w:szCs w:val="20"/>
-        </w:rPr>
         <w:t xml:space="preserve">Kundenkategorie / Kundengruppe</w:t>
       </w:r>
     </w:p>
@@ -3949,6 +4076,22 @@
           <w:szCs w:val="20"/>
         </w:rPr>
         <w:t xml:space="preserve">Kreditlimit</w:t>
+      </w:r>
+    </w:p>
+    <w:p>
+      <w:pPr>
+        <w:spacing w:after="120"/>
+      </w:pPr>
+      <w:r>
+        <w:rPr>
+          <w:rFonts w:ascii="Arial" w:cs="Arial" w:eastAsia="Arial" w:hAnsi="Arial"/>
+          <w:b/>
+          <w:bCs/>
+          <w:color w:val="333333"/>
+          <w:sz w:val="20"/>
+          <w:szCs w:val="20"/>
+        </w:rPr>
+        <w:t xml:space="preserve">Wichtig: Wir benötigen auch die Ansprechpartner zum Kunden. Idealerweise werden diese beim Kunden-Export mitgeliefert (z.B. als verschachtelte Ansprechpartner-Elemente im XML). Falls das technisch nicht möglich ist, brauchen wir zumindest den separaten WebKontakteExport (Type 7, siehe Abschnitt 3.5).</w:t>
       </w:r>
     </w:p>
     <w:p>
@@ -4836,6 +4979,22 @@
           <w:szCs w:val="20"/>
         </w:rPr>
         <w:t xml:space="preserve">Wir senden XML im Format: &lt;WebKontenImport&gt;&lt;Name&gt;...&lt;/Name&gt;&lt;Ort&gt;...&lt;/Ort&gt;...&lt;/WebKontenImport&gt;</w:t>
+      </w:r>
+    </w:p>
+    <w:p>
+      <w:pPr>
+        <w:spacing w:after="120"/>
+      </w:pPr>
+      <w:r>
+        <w:rPr>
+          <w:rFonts w:ascii="Arial" w:cs="Arial" w:eastAsia="Arial" w:hAnsi="Arial"/>
+          <w:b/>
+          <w:bCs/>
+          <w:color w:val="333333"/>
+          <w:sz w:val="20"/>
+          <w:szCs w:val="20"/>
+        </w:rPr>
+        <w:t xml:space="preserve">Wichtig: Beim Anlegen eines Kunden möchten wir auch gleich die Ansprechpartner mitanlegen können. Idealerweise als Teil des Kunden-Imports (verschachtelte Ansprechpartner-Elemente). Falls das nicht möglich ist, brauchen wir den separaten WebKontakteImport (Type 7, siehe Abschnitt 3.6).</w:t>
       </w:r>
     </w:p>
     <w:p>
@@ -5562,7 +5721,7 @@
           <w:sz w:val="24"/>
           <w:szCs w:val="24"/>
         </w:rPr>
-        <w:t xml:space="preserve">3.5 WebKontakteExport (Type 7) — Kontaktpersonen</w:t>
+        <w:t xml:space="preserve">3.5 WebKontakteExport (Type 7) — Ansprechpartner lesen</w:t>
       </w:r>
     </w:p>
     <w:p>
@@ -5576,7 +5735,7 @@
           <w:sz w:val="20"/>
           <w:szCs w:val="20"/>
         </w:rPr>
-        <w:t xml:space="preserve">Status: Fehlt. Wir benötigen diese Vorlage um Kontaktpersonen pro Kunde abzurufen (WHERE T045.C039 = Kundennummer).</w:t>
+        <w:t xml:space="preserve">Status: Fehlt. Wir benötigen diese Vorlage um Ansprechpartner pro Kunde abzurufen. Jeder Kunde kann mehrere Ansprechpartner haben. Die Abfrage erfolgt per WHERE auf die Kundennummer.</w:t>
       </w:r>
     </w:p>
     <w:p>
@@ -5592,7 +5751,7 @@
           <w:sz w:val="20"/>
           <w:szCs w:val="20"/>
         </w:rPr>
-        <w:t xml:space="preserve">Benötigte Felder:</w:t>
+        <w:t xml:space="preserve">Benötigte Export-Felder:</w:t>
       </w:r>
     </w:p>
     <w:tbl>
@@ -5765,7 +5924,7 @@
                 <w:sz w:val="20"/>
                 <w:szCs w:val="20"/>
               </w:rPr>
-              <w:t xml:space="preserve">Verweis auf Kunde</w:t>
+              <w:t xml:space="preserve">Verweis auf Kunde (Kundennummer)</w:t>
             </w:r>
           </w:p>
         </w:tc>
@@ -5942,7 +6101,7 @@
                 <w:sz w:val="20"/>
                 <w:szCs w:val="20"/>
               </w:rPr>
-              <w:t xml:space="preserve">Vorname der Kontaktperson</w:t>
+              <w:t xml:space="preserve">Vorname des Ansprechpartners</w:t>
             </w:r>
           </w:p>
         </w:tc>
@@ -6031,7 +6190,7 @@
                 <w:sz w:val="20"/>
                 <w:szCs w:val="20"/>
               </w:rPr>
-              <w:t xml:space="preserve">Nachname der Kontaktperson</w:t>
+              <w:t xml:space="preserve">Nachname des Ansprechpartners</w:t>
             </w:r>
           </w:p>
         </w:tc>
@@ -6120,7 +6279,7 @@
                 <w:sz w:val="20"/>
                 <w:szCs w:val="20"/>
               </w:rPr>
-              <w:t xml:space="preserve">Position / Rolle</w:t>
+              <w:t xml:space="preserve">Position / Rolle im Unternehmen</w:t>
             </w:r>
           </w:p>
         </w:tc>
@@ -6180,7 +6339,7 @@
                 <w:sz w:val="20"/>
                 <w:szCs w:val="20"/>
               </w:rPr>
-              <w:t xml:space="preserve">Telefon</w:t>
+              <w:t xml:space="preserve">Abteilung</w:t>
             </w:r>
           </w:p>
         </w:tc>
@@ -6208,7 +6367,7 @@
                 <w:sz w:val="20"/>
                 <w:szCs w:val="20"/>
               </w:rPr>
-              <w:t xml:space="preserve">Direktwahl</w:t>
+              <w:t xml:space="preserve">Abteilung im Unternehmen</w:t>
             </w:r>
           </w:p>
         </w:tc>
@@ -6268,7 +6427,7 @@
                 <w:sz w:val="20"/>
                 <w:szCs w:val="20"/>
               </w:rPr>
-              <w:t xml:space="preserve">Mobil</w:t>
+              <w:t xml:space="preserve">Telefon</w:t>
             </w:r>
           </w:p>
         </w:tc>
@@ -6296,7 +6455,7 @@
                 <w:sz w:val="20"/>
                 <w:szCs w:val="20"/>
               </w:rPr>
-              <w:t xml:space="preserve">Mobilnummer</w:t>
+              <w:t xml:space="preserve">Direktwahl-Telefonnummer</w:t>
             </w:r>
           </w:p>
         </w:tc>
@@ -6356,6 +6515,94 @@
                 <w:sz w:val="20"/>
                 <w:szCs w:val="20"/>
               </w:rPr>
+              <w:t xml:space="preserve">Mobil</w:t>
+            </w:r>
+          </w:p>
+        </w:tc>
+        <w:tc>
+          <w:tcPr>
+            <w:tcW w:type="dxa" w:w="3373"/>
+            <w:tcBorders>
+              <w:top w:val="single" w:color="CCCCCC" w:sz="1"/>
+              <w:left w:val="single" w:color="CCCCCC" w:sz="1"/>
+              <w:bottom w:val="single" w:color="CCCCCC" w:sz="1"/>
+              <w:right w:val="single" w:color="CCCCCC" w:sz="1"/>
+            </w:tcBorders>
+            <w:tcMar>
+              <w:top w:type="dxa" w:w="60"/>
+              <w:left w:type="dxa" w:w="100"/>
+              <w:bottom w:type="dxa" w:w="60"/>
+              <w:right w:type="dxa" w:w="100"/>
+            </w:tcMar>
+          </w:tcPr>
+          <w:p>
+            <w:r>
+              <w:rPr>
+                <w:rFonts w:ascii="Arial" w:cs="Arial" w:eastAsia="Arial" w:hAnsi="Arial"/>
+                <w:color w:val="333333"/>
+                <w:sz w:val="20"/>
+                <w:szCs w:val="20"/>
+              </w:rPr>
+              <w:t xml:space="preserve">Mobilnummer</w:t>
+            </w:r>
+          </w:p>
+        </w:tc>
+        <w:tc>
+          <w:tcPr>
+            <w:tcW w:type="dxa" w:w="3856"/>
+            <w:tcBorders>
+              <w:top w:val="single" w:color="CCCCCC" w:sz="1"/>
+              <w:left w:val="single" w:color="CCCCCC" w:sz="1"/>
+              <w:bottom w:val="single" w:color="CCCCCC" w:sz="1"/>
+              <w:right w:val="single" w:color="CCCCCC" w:sz="1"/>
+            </w:tcBorders>
+            <w:tcMar>
+              <w:top w:type="dxa" w:w="60"/>
+              <w:left w:type="dxa" w:w="100"/>
+              <w:bottom w:type="dxa" w:w="60"/>
+              <w:right w:type="dxa" w:w="100"/>
+            </w:tcMar>
+          </w:tcPr>
+          <w:p>
+            <w:r>
+              <w:rPr>
+                <w:rFonts w:ascii="Arial" w:cs="Arial" w:eastAsia="Arial" w:hAnsi="Arial"/>
+                <w:color w:val="333333"/>
+                <w:sz w:val="20"/>
+                <w:szCs w:val="20"/>
+              </w:rPr>
+              <w:t xml:space="preserve">Nein</w:t>
+            </w:r>
+          </w:p>
+        </w:tc>
+      </w:tr>
+      <w:tr>
+        <w:tc>
+          <w:tcPr>
+            <w:tcW w:type="dxa" w:w="2409"/>
+            <w:tcBorders>
+              <w:top w:val="single" w:color="CCCCCC" w:sz="1"/>
+              <w:left w:val="single" w:color="CCCCCC" w:sz="1"/>
+              <w:bottom w:val="single" w:color="CCCCCC" w:sz="1"/>
+              <w:right w:val="single" w:color="CCCCCC" w:sz="1"/>
+            </w:tcBorders>
+            <w:tcMar>
+              <w:top w:type="dxa" w:w="60"/>
+              <w:left w:type="dxa" w:w="100"/>
+              <w:bottom w:type="dxa" w:w="60"/>
+              <w:right w:type="dxa" w:w="100"/>
+            </w:tcMar>
+          </w:tcPr>
+          <w:p>
+            <w:r>
+              <w:rPr>
+                <w:rFonts w:ascii="Arial" w:cs="Arial" w:eastAsia="Arial" w:hAnsi="Arial"/>
+                <w:b/>
+                <w:bCs/>
+                <w:color w:val="333333"/>
+                <w:sz w:val="20"/>
+                <w:szCs w:val="20"/>
+              </w:rPr>
               <w:t xml:space="preserve">Email</w:t>
             </w:r>
           </w:p>
@@ -6397,22 +6644,23 @@
               <w:bottom w:val="single" w:color="CCCCCC" w:sz="1"/>
               <w:right w:val="single" w:color="CCCCCC" w:sz="1"/>
             </w:tcBorders>
-            <w:tcMar>
-              <w:top w:type="dxa" w:w="60"/>
-              <w:left w:type="dxa" w:w="100"/>
-              <w:bottom w:type="dxa" w:w="60"/>
-              <w:right w:type="dxa" w:w="100"/>
-            </w:tcMar>
-          </w:tcPr>
-          <w:p>
-            <w:r>
-              <w:rPr>
-                <w:rFonts w:ascii="Arial" w:cs="Arial" w:eastAsia="Arial" w:hAnsi="Arial"/>
-                <w:color w:val="333333"/>
-                <w:sz w:val="20"/>
-                <w:szCs w:val="20"/>
-              </w:rPr>
-              <w:t xml:space="preserve">Nein</w:t>
+            <w:shd w:fill="FADBD8" w:val="clear"/>
+            <w:tcMar>
+              <w:top w:type="dxa" w:w="60"/>
+              <w:left w:type="dxa" w:w="100"/>
+              <w:bottom w:type="dxa" w:w="60"/>
+              <w:right w:type="dxa" w:w="100"/>
+            </w:tcMar>
+          </w:tcPr>
+          <w:p>
+            <w:r>
+              <w:rPr>
+                <w:rFonts w:ascii="Arial" w:cs="Arial" w:eastAsia="Arial" w:hAnsi="Arial"/>
+                <w:color w:val="333333"/>
+                <w:sz w:val="20"/>
+                <w:szCs w:val="20"/>
+              </w:rPr>
+              <w:t xml:space="preserve">Ja</w:t>
             </w:r>
           </w:p>
         </w:tc>
@@ -6432,7 +6680,981 @@
           <w:sz w:val="24"/>
           <w:szCs w:val="24"/>
         </w:rPr>
-        <w:t xml:space="preserve">3.6 WebBelegExport (Type 30) — Belege lesen</w:t>
+        <w:t xml:space="preserve">3.6 WebKontakteImport (Type 7) — Ansprechpartner anlegen</w:t>
+      </w:r>
+    </w:p>
+    <w:p>
+      <w:pPr>
+        <w:spacing w:after="120"/>
+      </w:pPr>
+      <w:r>
+        <w:rPr>
+          <w:rFonts w:ascii="Arial" w:cs="Arial" w:eastAsia="Arial" w:hAnsi="Arial"/>
+          <w:color w:val="333333"/>
+          <w:sz w:val="20"/>
+          <w:szCs w:val="20"/>
+        </w:rPr>
+        <w:t xml:space="preserve">Status: Fehlt. Wir möchten aus unserer Anwendung heraus Ansprechpartner zu bestehenden Kunden anlegen können. Wenn ein neuer Kunde angelegt wird, sollen auch gleich die Ansprechpartner miterfasst werden.</w:t>
+      </w:r>
+    </w:p>
+    <w:p>
+      <w:pPr>
+        <w:spacing w:after="120"/>
+      </w:pPr>
+      <w:r>
+        <w:rPr>
+          <w:rFonts w:ascii="Arial" w:cs="Arial" w:eastAsia="Arial" w:hAnsi="Arial"/>
+          <w:b/>
+          <w:bCs/>
+          <w:color w:val="333333"/>
+          <w:sz w:val="20"/>
+          <w:szCs w:val="20"/>
+        </w:rPr>
+        <w:t xml:space="preserve">Benötigte Import-Felder:</w:t>
+      </w:r>
+    </w:p>
+    <w:tbl>
+      <w:tblPr>
+        <w:tblW w:type="dxa" w:w="9638"/>
+        <w:tblBorders>
+          <w:top w:val="single" w:color="auto" w:sz="4"/>
+          <w:left w:val="single" w:color="auto" w:sz="4"/>
+          <w:bottom w:val="single" w:color="auto" w:sz="4"/>
+          <w:right w:val="single" w:color="auto" w:sz="4"/>
+          <w:insideH w:val="single" w:color="auto" w:sz="4"/>
+          <w:insideV w:val="single" w:color="auto" w:sz="4"/>
+        </w:tblBorders>
+      </w:tblPr>
+      <w:tblGrid>
+        <w:gridCol w:w="2409"/>
+        <w:gridCol w:w="3373"/>
+        <w:gridCol w:w="3856"/>
+      </w:tblGrid>
+      <w:tr>
+        <w:tc>
+          <w:tcPr>
+            <w:tcW w:type="dxa" w:w="2409"/>
+            <w:tcBorders>
+              <w:top w:val="single" w:color="1F4E79" w:sz="1"/>
+              <w:left w:val="single" w:color="1F4E79" w:sz="1"/>
+              <w:bottom w:val="single" w:color="1F4E79" w:sz="1"/>
+              <w:right w:val="single" w:color="1F4E79" w:sz="1"/>
+            </w:tcBorders>
+            <w:shd w:fill="1F4E79" w:val="clear"/>
+            <w:tcMar>
+              <w:top w:type="dxa" w:w="60"/>
+              <w:left w:type="dxa" w:w="100"/>
+              <w:bottom w:type="dxa" w:w="60"/>
+              <w:right w:type="dxa" w:w="100"/>
+            </w:tcMar>
+            <w:vAlign w:val="center"/>
+          </w:tcPr>
+          <w:p>
+            <w:r>
+              <w:rPr>
+                <w:rFonts w:ascii="Arial" w:cs="Arial" w:eastAsia="Arial" w:hAnsi="Arial"/>
+                <w:b/>
+                <w:bCs/>
+                <w:color w:val="FFFFFF"/>
+                <w:sz w:val="20"/>
+                <w:szCs w:val="20"/>
+              </w:rPr>
+              <w:t xml:space="preserve">Feldname</w:t>
+            </w:r>
+          </w:p>
+        </w:tc>
+        <w:tc>
+          <w:tcPr>
+            <w:tcW w:type="dxa" w:w="3373"/>
+            <w:tcBorders>
+              <w:top w:val="single" w:color="1F4E79" w:sz="1"/>
+              <w:left w:val="single" w:color="1F4E79" w:sz="1"/>
+              <w:bottom w:val="single" w:color="1F4E79" w:sz="1"/>
+              <w:right w:val="single" w:color="1F4E79" w:sz="1"/>
+            </w:tcBorders>
+            <w:shd w:fill="1F4E79" w:val="clear"/>
+            <w:tcMar>
+              <w:top w:type="dxa" w:w="60"/>
+              <w:left w:type="dxa" w:w="100"/>
+              <w:bottom w:type="dxa" w:w="60"/>
+              <w:right w:type="dxa" w:w="100"/>
+            </w:tcMar>
+            <w:vAlign w:val="center"/>
+          </w:tcPr>
+          <w:p>
+            <w:r>
+              <w:rPr>
+                <w:rFonts w:ascii="Arial" w:cs="Arial" w:eastAsia="Arial" w:hAnsi="Arial"/>
+                <w:b/>
+                <w:bCs/>
+                <w:color w:val="FFFFFF"/>
+                <w:sz w:val="20"/>
+                <w:szCs w:val="20"/>
+              </w:rPr>
+              <w:t xml:space="preserve">Beschreibung</w:t>
+            </w:r>
+          </w:p>
+        </w:tc>
+        <w:tc>
+          <w:tcPr>
+            <w:tcW w:type="dxa" w:w="3856"/>
+            <w:tcBorders>
+              <w:top w:val="single" w:color="1F4E79" w:sz="1"/>
+              <w:left w:val="single" w:color="1F4E79" w:sz="1"/>
+              <w:bottom w:val="single" w:color="1F4E79" w:sz="1"/>
+              <w:right w:val="single" w:color="1F4E79" w:sz="1"/>
+            </w:tcBorders>
+            <w:shd w:fill="1F4E79" w:val="clear"/>
+            <w:tcMar>
+              <w:top w:type="dxa" w:w="60"/>
+              <w:left w:type="dxa" w:w="100"/>
+              <w:bottom w:type="dxa" w:w="60"/>
+              <w:right w:type="dxa" w:w="100"/>
+            </w:tcMar>
+            <w:vAlign w:val="center"/>
+          </w:tcPr>
+          <w:p>
+            <w:r>
+              <w:rPr>
+                <w:rFonts w:ascii="Arial" w:cs="Arial" w:eastAsia="Arial" w:hAnsi="Arial"/>
+                <w:b/>
+                <w:bCs/>
+                <w:color w:val="FFFFFF"/>
+                <w:sz w:val="20"/>
+                <w:szCs w:val="20"/>
+              </w:rPr>
+              <w:t xml:space="preserve">Pflicht</w:t>
+            </w:r>
+          </w:p>
+        </w:tc>
+      </w:tr>
+      <w:tr>
+        <w:tc>
+          <w:tcPr>
+            <w:tcW w:type="dxa" w:w="2409"/>
+            <w:tcBorders>
+              <w:top w:val="single" w:color="CCCCCC" w:sz="1"/>
+              <w:left w:val="single" w:color="CCCCCC" w:sz="1"/>
+              <w:bottom w:val="single" w:color="CCCCCC" w:sz="1"/>
+              <w:right w:val="single" w:color="CCCCCC" w:sz="1"/>
+            </w:tcBorders>
+            <w:tcMar>
+              <w:top w:type="dxa" w:w="60"/>
+              <w:left w:type="dxa" w:w="100"/>
+              <w:bottom w:type="dxa" w:w="60"/>
+              <w:right w:type="dxa" w:w="100"/>
+            </w:tcMar>
+          </w:tcPr>
+          <w:p>
+            <w:r>
+              <w:rPr>
+                <w:rFonts w:ascii="Arial" w:cs="Arial" w:eastAsia="Arial" w:hAnsi="Arial"/>
+                <w:b/>
+                <w:bCs/>
+                <w:color w:val="333333"/>
+                <w:sz w:val="20"/>
+                <w:szCs w:val="20"/>
+              </w:rPr>
+              <w:t xml:space="preserve">Kontonummer</w:t>
+            </w:r>
+          </w:p>
+        </w:tc>
+        <w:tc>
+          <w:tcPr>
+            <w:tcW w:type="dxa" w:w="3373"/>
+            <w:tcBorders>
+              <w:top w:val="single" w:color="CCCCCC" w:sz="1"/>
+              <w:left w:val="single" w:color="CCCCCC" w:sz="1"/>
+              <w:bottom w:val="single" w:color="CCCCCC" w:sz="1"/>
+              <w:right w:val="single" w:color="CCCCCC" w:sz="1"/>
+            </w:tcBorders>
+            <w:tcMar>
+              <w:top w:type="dxa" w:w="60"/>
+              <w:left w:type="dxa" w:w="100"/>
+              <w:bottom w:type="dxa" w:w="60"/>
+              <w:right w:type="dxa" w:w="100"/>
+            </w:tcMar>
+          </w:tcPr>
+          <w:p>
+            <w:r>
+              <w:rPr>
+                <w:rFonts w:ascii="Arial" w:cs="Arial" w:eastAsia="Arial" w:hAnsi="Arial"/>
+                <w:color w:val="333333"/>
+                <w:sz w:val="20"/>
+                <w:szCs w:val="20"/>
+              </w:rPr>
+              <w:t xml:space="preserve">Verweis auf bestehenden Kunden</w:t>
+            </w:r>
+          </w:p>
+        </w:tc>
+        <w:tc>
+          <w:tcPr>
+            <w:tcW w:type="dxa" w:w="3856"/>
+            <w:tcBorders>
+              <w:top w:val="single" w:color="CCCCCC" w:sz="1"/>
+              <w:left w:val="single" w:color="CCCCCC" w:sz="1"/>
+              <w:bottom w:val="single" w:color="CCCCCC" w:sz="1"/>
+              <w:right w:val="single" w:color="CCCCCC" w:sz="1"/>
+            </w:tcBorders>
+            <w:shd w:fill="FADBD8" w:val="clear"/>
+            <w:tcMar>
+              <w:top w:type="dxa" w:w="60"/>
+              <w:left w:type="dxa" w:w="100"/>
+              <w:bottom w:type="dxa" w:w="60"/>
+              <w:right w:type="dxa" w:w="100"/>
+            </w:tcMar>
+          </w:tcPr>
+          <w:p>
+            <w:r>
+              <w:rPr>
+                <w:rFonts w:ascii="Arial" w:cs="Arial" w:eastAsia="Arial" w:hAnsi="Arial"/>
+                <w:color w:val="333333"/>
+                <w:sz w:val="20"/>
+                <w:szCs w:val="20"/>
+              </w:rPr>
+              <w:t xml:space="preserve">Ja</w:t>
+            </w:r>
+          </w:p>
+        </w:tc>
+      </w:tr>
+      <w:tr>
+        <w:tc>
+          <w:tcPr>
+            <w:tcW w:type="dxa" w:w="2409"/>
+            <w:tcBorders>
+              <w:top w:val="single" w:color="CCCCCC" w:sz="1"/>
+              <w:left w:val="single" w:color="CCCCCC" w:sz="1"/>
+              <w:bottom w:val="single" w:color="CCCCCC" w:sz="1"/>
+              <w:right w:val="single" w:color="CCCCCC" w:sz="1"/>
+            </w:tcBorders>
+            <w:tcMar>
+              <w:top w:type="dxa" w:w="60"/>
+              <w:left w:type="dxa" w:w="100"/>
+              <w:bottom w:type="dxa" w:w="60"/>
+              <w:right w:type="dxa" w:w="100"/>
+            </w:tcMar>
+          </w:tcPr>
+          <w:p>
+            <w:r>
+              <w:rPr>
+                <w:rFonts w:ascii="Arial" w:cs="Arial" w:eastAsia="Arial" w:hAnsi="Arial"/>
+                <w:b/>
+                <w:bCs/>
+                <w:color w:val="333333"/>
+                <w:sz w:val="20"/>
+                <w:szCs w:val="20"/>
+              </w:rPr>
+              <w:t xml:space="preserve">Anrede</w:t>
+            </w:r>
+          </w:p>
+        </w:tc>
+        <w:tc>
+          <w:tcPr>
+            <w:tcW w:type="dxa" w:w="3373"/>
+            <w:tcBorders>
+              <w:top w:val="single" w:color="CCCCCC" w:sz="1"/>
+              <w:left w:val="single" w:color="CCCCCC" w:sz="1"/>
+              <w:bottom w:val="single" w:color="CCCCCC" w:sz="1"/>
+              <w:right w:val="single" w:color="CCCCCC" w:sz="1"/>
+            </w:tcBorders>
+            <w:tcMar>
+              <w:top w:type="dxa" w:w="60"/>
+              <w:left w:type="dxa" w:w="100"/>
+              <w:bottom w:type="dxa" w:w="60"/>
+              <w:right w:type="dxa" w:w="100"/>
+            </w:tcMar>
+          </w:tcPr>
+          <w:p>
+            <w:r>
+              <w:rPr>
+                <w:rFonts w:ascii="Arial" w:cs="Arial" w:eastAsia="Arial" w:hAnsi="Arial"/>
+                <w:color w:val="333333"/>
+                <w:sz w:val="20"/>
+                <w:szCs w:val="20"/>
+              </w:rPr>
+              <w:t xml:space="preserve">Herr / Frau</w:t>
+            </w:r>
+          </w:p>
+        </w:tc>
+        <w:tc>
+          <w:tcPr>
+            <w:tcW w:type="dxa" w:w="3856"/>
+            <w:tcBorders>
+              <w:top w:val="single" w:color="CCCCCC" w:sz="1"/>
+              <w:left w:val="single" w:color="CCCCCC" w:sz="1"/>
+              <w:bottom w:val="single" w:color="CCCCCC" w:sz="1"/>
+              <w:right w:val="single" w:color="CCCCCC" w:sz="1"/>
+            </w:tcBorders>
+            <w:tcMar>
+              <w:top w:type="dxa" w:w="60"/>
+              <w:left w:type="dxa" w:w="100"/>
+              <w:bottom w:type="dxa" w:w="60"/>
+              <w:right w:type="dxa" w:w="100"/>
+            </w:tcMar>
+          </w:tcPr>
+          <w:p>
+            <w:r>
+              <w:rPr>
+                <w:rFonts w:ascii="Arial" w:cs="Arial" w:eastAsia="Arial" w:hAnsi="Arial"/>
+                <w:color w:val="333333"/>
+                <w:sz w:val="20"/>
+                <w:szCs w:val="20"/>
+              </w:rPr>
+              <w:t xml:space="preserve">Nein</w:t>
+            </w:r>
+          </w:p>
+        </w:tc>
+      </w:tr>
+      <w:tr>
+        <w:tc>
+          <w:tcPr>
+            <w:tcW w:type="dxa" w:w="2409"/>
+            <w:tcBorders>
+              <w:top w:val="single" w:color="CCCCCC" w:sz="1"/>
+              <w:left w:val="single" w:color="CCCCCC" w:sz="1"/>
+              <w:bottom w:val="single" w:color="CCCCCC" w:sz="1"/>
+              <w:right w:val="single" w:color="CCCCCC" w:sz="1"/>
+            </w:tcBorders>
+            <w:tcMar>
+              <w:top w:type="dxa" w:w="60"/>
+              <w:left w:type="dxa" w:w="100"/>
+              <w:bottom w:type="dxa" w:w="60"/>
+              <w:right w:type="dxa" w:w="100"/>
+            </w:tcMar>
+          </w:tcPr>
+          <w:p>
+            <w:r>
+              <w:rPr>
+                <w:rFonts w:ascii="Arial" w:cs="Arial" w:eastAsia="Arial" w:hAnsi="Arial"/>
+                <w:b/>
+                <w:bCs/>
+                <w:color w:val="333333"/>
+                <w:sz w:val="20"/>
+                <w:szCs w:val="20"/>
+              </w:rPr>
+              <w:t xml:space="preserve">Vorname</w:t>
+            </w:r>
+          </w:p>
+        </w:tc>
+        <w:tc>
+          <w:tcPr>
+            <w:tcW w:type="dxa" w:w="3373"/>
+            <w:tcBorders>
+              <w:top w:val="single" w:color="CCCCCC" w:sz="1"/>
+              <w:left w:val="single" w:color="CCCCCC" w:sz="1"/>
+              <w:bottom w:val="single" w:color="CCCCCC" w:sz="1"/>
+              <w:right w:val="single" w:color="CCCCCC" w:sz="1"/>
+            </w:tcBorders>
+            <w:tcMar>
+              <w:top w:type="dxa" w:w="60"/>
+              <w:left w:type="dxa" w:w="100"/>
+              <w:bottom w:type="dxa" w:w="60"/>
+              <w:right w:type="dxa" w:w="100"/>
+            </w:tcMar>
+          </w:tcPr>
+          <w:p>
+            <w:r>
+              <w:rPr>
+                <w:rFonts w:ascii="Arial" w:cs="Arial" w:eastAsia="Arial" w:hAnsi="Arial"/>
+                <w:color w:val="333333"/>
+                <w:sz w:val="20"/>
+                <w:szCs w:val="20"/>
+              </w:rPr>
+              <w:t xml:space="preserve">Vorname des Ansprechpartners</w:t>
+            </w:r>
+          </w:p>
+        </w:tc>
+        <w:tc>
+          <w:tcPr>
+            <w:tcW w:type="dxa" w:w="3856"/>
+            <w:tcBorders>
+              <w:top w:val="single" w:color="CCCCCC" w:sz="1"/>
+              <w:left w:val="single" w:color="CCCCCC" w:sz="1"/>
+              <w:bottom w:val="single" w:color="CCCCCC" w:sz="1"/>
+              <w:right w:val="single" w:color="CCCCCC" w:sz="1"/>
+            </w:tcBorders>
+            <w:shd w:fill="FADBD8" w:val="clear"/>
+            <w:tcMar>
+              <w:top w:type="dxa" w:w="60"/>
+              <w:left w:type="dxa" w:w="100"/>
+              <w:bottom w:type="dxa" w:w="60"/>
+              <w:right w:type="dxa" w:w="100"/>
+            </w:tcMar>
+          </w:tcPr>
+          <w:p>
+            <w:r>
+              <w:rPr>
+                <w:rFonts w:ascii="Arial" w:cs="Arial" w:eastAsia="Arial" w:hAnsi="Arial"/>
+                <w:color w:val="333333"/>
+                <w:sz w:val="20"/>
+                <w:szCs w:val="20"/>
+              </w:rPr>
+              <w:t xml:space="preserve">Ja</w:t>
+            </w:r>
+          </w:p>
+        </w:tc>
+      </w:tr>
+      <w:tr>
+        <w:tc>
+          <w:tcPr>
+            <w:tcW w:type="dxa" w:w="2409"/>
+            <w:tcBorders>
+              <w:top w:val="single" w:color="CCCCCC" w:sz="1"/>
+              <w:left w:val="single" w:color="CCCCCC" w:sz="1"/>
+              <w:bottom w:val="single" w:color="CCCCCC" w:sz="1"/>
+              <w:right w:val="single" w:color="CCCCCC" w:sz="1"/>
+            </w:tcBorders>
+            <w:tcMar>
+              <w:top w:type="dxa" w:w="60"/>
+              <w:left w:type="dxa" w:w="100"/>
+              <w:bottom w:type="dxa" w:w="60"/>
+              <w:right w:type="dxa" w:w="100"/>
+            </w:tcMar>
+          </w:tcPr>
+          <w:p>
+            <w:r>
+              <w:rPr>
+                <w:rFonts w:ascii="Arial" w:cs="Arial" w:eastAsia="Arial" w:hAnsi="Arial"/>
+                <w:b/>
+                <w:bCs/>
+                <w:color w:val="333333"/>
+                <w:sz w:val="20"/>
+                <w:szCs w:val="20"/>
+              </w:rPr>
+              <w:t xml:space="preserve">Nachname</w:t>
+            </w:r>
+          </w:p>
+        </w:tc>
+        <w:tc>
+          <w:tcPr>
+            <w:tcW w:type="dxa" w:w="3373"/>
+            <w:tcBorders>
+              <w:top w:val="single" w:color="CCCCCC" w:sz="1"/>
+              <w:left w:val="single" w:color="CCCCCC" w:sz="1"/>
+              <w:bottom w:val="single" w:color="CCCCCC" w:sz="1"/>
+              <w:right w:val="single" w:color="CCCCCC" w:sz="1"/>
+            </w:tcBorders>
+            <w:tcMar>
+              <w:top w:type="dxa" w:w="60"/>
+              <w:left w:type="dxa" w:w="100"/>
+              <w:bottom w:type="dxa" w:w="60"/>
+              <w:right w:type="dxa" w:w="100"/>
+            </w:tcMar>
+          </w:tcPr>
+          <w:p>
+            <w:r>
+              <w:rPr>
+                <w:rFonts w:ascii="Arial" w:cs="Arial" w:eastAsia="Arial" w:hAnsi="Arial"/>
+                <w:color w:val="333333"/>
+                <w:sz w:val="20"/>
+                <w:szCs w:val="20"/>
+              </w:rPr>
+              <w:t xml:space="preserve">Nachname des Ansprechpartners</w:t>
+            </w:r>
+          </w:p>
+        </w:tc>
+        <w:tc>
+          <w:tcPr>
+            <w:tcW w:type="dxa" w:w="3856"/>
+            <w:tcBorders>
+              <w:top w:val="single" w:color="CCCCCC" w:sz="1"/>
+              <w:left w:val="single" w:color="CCCCCC" w:sz="1"/>
+              <w:bottom w:val="single" w:color="CCCCCC" w:sz="1"/>
+              <w:right w:val="single" w:color="CCCCCC" w:sz="1"/>
+            </w:tcBorders>
+            <w:shd w:fill="FADBD8" w:val="clear"/>
+            <w:tcMar>
+              <w:top w:type="dxa" w:w="60"/>
+              <w:left w:type="dxa" w:w="100"/>
+              <w:bottom w:type="dxa" w:w="60"/>
+              <w:right w:type="dxa" w:w="100"/>
+            </w:tcMar>
+          </w:tcPr>
+          <w:p>
+            <w:r>
+              <w:rPr>
+                <w:rFonts w:ascii="Arial" w:cs="Arial" w:eastAsia="Arial" w:hAnsi="Arial"/>
+                <w:color w:val="333333"/>
+                <w:sz w:val="20"/>
+                <w:szCs w:val="20"/>
+              </w:rPr>
+              <w:t xml:space="preserve">Ja</w:t>
+            </w:r>
+          </w:p>
+        </w:tc>
+      </w:tr>
+      <w:tr>
+        <w:tc>
+          <w:tcPr>
+            <w:tcW w:type="dxa" w:w="2409"/>
+            <w:tcBorders>
+              <w:top w:val="single" w:color="CCCCCC" w:sz="1"/>
+              <w:left w:val="single" w:color="CCCCCC" w:sz="1"/>
+              <w:bottom w:val="single" w:color="CCCCCC" w:sz="1"/>
+              <w:right w:val="single" w:color="CCCCCC" w:sz="1"/>
+            </w:tcBorders>
+            <w:tcMar>
+              <w:top w:type="dxa" w:w="60"/>
+              <w:left w:type="dxa" w:w="100"/>
+              <w:bottom w:type="dxa" w:w="60"/>
+              <w:right w:type="dxa" w:w="100"/>
+            </w:tcMar>
+          </w:tcPr>
+          <w:p>
+            <w:r>
+              <w:rPr>
+                <w:rFonts w:ascii="Arial" w:cs="Arial" w:eastAsia="Arial" w:hAnsi="Arial"/>
+                <w:b/>
+                <w:bCs/>
+                <w:color w:val="333333"/>
+                <w:sz w:val="20"/>
+                <w:szCs w:val="20"/>
+              </w:rPr>
+              <w:t xml:space="preserve">Funktion</w:t>
+            </w:r>
+          </w:p>
+        </w:tc>
+        <w:tc>
+          <w:tcPr>
+            <w:tcW w:type="dxa" w:w="3373"/>
+            <w:tcBorders>
+              <w:top w:val="single" w:color="CCCCCC" w:sz="1"/>
+              <w:left w:val="single" w:color="CCCCCC" w:sz="1"/>
+              <w:bottom w:val="single" w:color="CCCCCC" w:sz="1"/>
+              <w:right w:val="single" w:color="CCCCCC" w:sz="1"/>
+            </w:tcBorders>
+            <w:tcMar>
+              <w:top w:type="dxa" w:w="60"/>
+              <w:left w:type="dxa" w:w="100"/>
+              <w:bottom w:type="dxa" w:w="60"/>
+              <w:right w:type="dxa" w:w="100"/>
+            </w:tcMar>
+          </w:tcPr>
+          <w:p>
+            <w:r>
+              <w:rPr>
+                <w:rFonts w:ascii="Arial" w:cs="Arial" w:eastAsia="Arial" w:hAnsi="Arial"/>
+                <w:color w:val="333333"/>
+                <w:sz w:val="20"/>
+                <w:szCs w:val="20"/>
+              </w:rPr>
+              <w:t xml:space="preserve">Position / Rolle</w:t>
+            </w:r>
+          </w:p>
+        </w:tc>
+        <w:tc>
+          <w:tcPr>
+            <w:tcW w:type="dxa" w:w="3856"/>
+            <w:tcBorders>
+              <w:top w:val="single" w:color="CCCCCC" w:sz="1"/>
+              <w:left w:val="single" w:color="CCCCCC" w:sz="1"/>
+              <w:bottom w:val="single" w:color="CCCCCC" w:sz="1"/>
+              <w:right w:val="single" w:color="CCCCCC" w:sz="1"/>
+            </w:tcBorders>
+            <w:tcMar>
+              <w:top w:type="dxa" w:w="60"/>
+              <w:left w:type="dxa" w:w="100"/>
+              <w:bottom w:type="dxa" w:w="60"/>
+              <w:right w:type="dxa" w:w="100"/>
+            </w:tcMar>
+          </w:tcPr>
+          <w:p>
+            <w:r>
+              <w:rPr>
+                <w:rFonts w:ascii="Arial" w:cs="Arial" w:eastAsia="Arial" w:hAnsi="Arial"/>
+                <w:color w:val="333333"/>
+                <w:sz w:val="20"/>
+                <w:szCs w:val="20"/>
+              </w:rPr>
+              <w:t xml:space="preserve">Nein</w:t>
+            </w:r>
+          </w:p>
+        </w:tc>
+      </w:tr>
+      <w:tr>
+        <w:tc>
+          <w:tcPr>
+            <w:tcW w:type="dxa" w:w="2409"/>
+            <w:tcBorders>
+              <w:top w:val="single" w:color="CCCCCC" w:sz="1"/>
+              <w:left w:val="single" w:color="CCCCCC" w:sz="1"/>
+              <w:bottom w:val="single" w:color="CCCCCC" w:sz="1"/>
+              <w:right w:val="single" w:color="CCCCCC" w:sz="1"/>
+            </w:tcBorders>
+            <w:tcMar>
+              <w:top w:type="dxa" w:w="60"/>
+              <w:left w:type="dxa" w:w="100"/>
+              <w:bottom w:type="dxa" w:w="60"/>
+              <w:right w:type="dxa" w:w="100"/>
+            </w:tcMar>
+          </w:tcPr>
+          <w:p>
+            <w:r>
+              <w:rPr>
+                <w:rFonts w:ascii="Arial" w:cs="Arial" w:eastAsia="Arial" w:hAnsi="Arial"/>
+                <w:b/>
+                <w:bCs/>
+                <w:color w:val="333333"/>
+                <w:sz w:val="20"/>
+                <w:szCs w:val="20"/>
+              </w:rPr>
+              <w:t xml:space="preserve">Abteilung</w:t>
+            </w:r>
+          </w:p>
+        </w:tc>
+        <w:tc>
+          <w:tcPr>
+            <w:tcW w:type="dxa" w:w="3373"/>
+            <w:tcBorders>
+              <w:top w:val="single" w:color="CCCCCC" w:sz="1"/>
+              <w:left w:val="single" w:color="CCCCCC" w:sz="1"/>
+              <w:bottom w:val="single" w:color="CCCCCC" w:sz="1"/>
+              <w:right w:val="single" w:color="CCCCCC" w:sz="1"/>
+            </w:tcBorders>
+            <w:tcMar>
+              <w:top w:type="dxa" w:w="60"/>
+              <w:left w:type="dxa" w:w="100"/>
+              <w:bottom w:type="dxa" w:w="60"/>
+              <w:right w:type="dxa" w:w="100"/>
+            </w:tcMar>
+          </w:tcPr>
+          <w:p>
+            <w:r>
+              <w:rPr>
+                <w:rFonts w:ascii="Arial" w:cs="Arial" w:eastAsia="Arial" w:hAnsi="Arial"/>
+                <w:color w:val="333333"/>
+                <w:sz w:val="20"/>
+                <w:szCs w:val="20"/>
+              </w:rPr>
+              <w:t xml:space="preserve">Abteilung im Unternehmen</w:t>
+            </w:r>
+          </w:p>
+        </w:tc>
+        <w:tc>
+          <w:tcPr>
+            <w:tcW w:type="dxa" w:w="3856"/>
+            <w:tcBorders>
+              <w:top w:val="single" w:color="CCCCCC" w:sz="1"/>
+              <w:left w:val="single" w:color="CCCCCC" w:sz="1"/>
+              <w:bottom w:val="single" w:color="CCCCCC" w:sz="1"/>
+              <w:right w:val="single" w:color="CCCCCC" w:sz="1"/>
+            </w:tcBorders>
+            <w:tcMar>
+              <w:top w:type="dxa" w:w="60"/>
+              <w:left w:type="dxa" w:w="100"/>
+              <w:bottom w:type="dxa" w:w="60"/>
+              <w:right w:type="dxa" w:w="100"/>
+            </w:tcMar>
+          </w:tcPr>
+          <w:p>
+            <w:r>
+              <w:rPr>
+                <w:rFonts w:ascii="Arial" w:cs="Arial" w:eastAsia="Arial" w:hAnsi="Arial"/>
+                <w:color w:val="333333"/>
+                <w:sz w:val="20"/>
+                <w:szCs w:val="20"/>
+              </w:rPr>
+              <w:t xml:space="preserve">Nein</w:t>
+            </w:r>
+          </w:p>
+        </w:tc>
+      </w:tr>
+      <w:tr>
+        <w:tc>
+          <w:tcPr>
+            <w:tcW w:type="dxa" w:w="2409"/>
+            <w:tcBorders>
+              <w:top w:val="single" w:color="CCCCCC" w:sz="1"/>
+              <w:left w:val="single" w:color="CCCCCC" w:sz="1"/>
+              <w:bottom w:val="single" w:color="CCCCCC" w:sz="1"/>
+              <w:right w:val="single" w:color="CCCCCC" w:sz="1"/>
+            </w:tcBorders>
+            <w:tcMar>
+              <w:top w:type="dxa" w:w="60"/>
+              <w:left w:type="dxa" w:w="100"/>
+              <w:bottom w:type="dxa" w:w="60"/>
+              <w:right w:type="dxa" w:w="100"/>
+            </w:tcMar>
+          </w:tcPr>
+          <w:p>
+            <w:r>
+              <w:rPr>
+                <w:rFonts w:ascii="Arial" w:cs="Arial" w:eastAsia="Arial" w:hAnsi="Arial"/>
+                <w:b/>
+                <w:bCs/>
+                <w:color w:val="333333"/>
+                <w:sz w:val="20"/>
+                <w:szCs w:val="20"/>
+              </w:rPr>
+              <w:t xml:space="preserve">Telefon</w:t>
+            </w:r>
+          </w:p>
+        </w:tc>
+        <w:tc>
+          <w:tcPr>
+            <w:tcW w:type="dxa" w:w="3373"/>
+            <w:tcBorders>
+              <w:top w:val="single" w:color="CCCCCC" w:sz="1"/>
+              <w:left w:val="single" w:color="CCCCCC" w:sz="1"/>
+              <w:bottom w:val="single" w:color="CCCCCC" w:sz="1"/>
+              <w:right w:val="single" w:color="CCCCCC" w:sz="1"/>
+            </w:tcBorders>
+            <w:tcMar>
+              <w:top w:type="dxa" w:w="60"/>
+              <w:left w:type="dxa" w:w="100"/>
+              <w:bottom w:type="dxa" w:w="60"/>
+              <w:right w:type="dxa" w:w="100"/>
+            </w:tcMar>
+          </w:tcPr>
+          <w:p>
+            <w:r>
+              <w:rPr>
+                <w:rFonts w:ascii="Arial" w:cs="Arial" w:eastAsia="Arial" w:hAnsi="Arial"/>
+                <w:color w:val="333333"/>
+                <w:sz w:val="20"/>
+                <w:szCs w:val="20"/>
+              </w:rPr>
+              <w:t xml:space="preserve">Direktwahl-Telefonnummer</w:t>
+            </w:r>
+          </w:p>
+        </w:tc>
+        <w:tc>
+          <w:tcPr>
+            <w:tcW w:type="dxa" w:w="3856"/>
+            <w:tcBorders>
+              <w:top w:val="single" w:color="CCCCCC" w:sz="1"/>
+              <w:left w:val="single" w:color="CCCCCC" w:sz="1"/>
+              <w:bottom w:val="single" w:color="CCCCCC" w:sz="1"/>
+              <w:right w:val="single" w:color="CCCCCC" w:sz="1"/>
+            </w:tcBorders>
+            <w:tcMar>
+              <w:top w:type="dxa" w:w="60"/>
+              <w:left w:type="dxa" w:w="100"/>
+              <w:bottom w:type="dxa" w:w="60"/>
+              <w:right w:type="dxa" w:w="100"/>
+            </w:tcMar>
+          </w:tcPr>
+          <w:p>
+            <w:r>
+              <w:rPr>
+                <w:rFonts w:ascii="Arial" w:cs="Arial" w:eastAsia="Arial" w:hAnsi="Arial"/>
+                <w:color w:val="333333"/>
+                <w:sz w:val="20"/>
+                <w:szCs w:val="20"/>
+              </w:rPr>
+              <w:t xml:space="preserve">Nein</w:t>
+            </w:r>
+          </w:p>
+        </w:tc>
+      </w:tr>
+      <w:tr>
+        <w:tc>
+          <w:tcPr>
+            <w:tcW w:type="dxa" w:w="2409"/>
+            <w:tcBorders>
+              <w:top w:val="single" w:color="CCCCCC" w:sz="1"/>
+              <w:left w:val="single" w:color="CCCCCC" w:sz="1"/>
+              <w:bottom w:val="single" w:color="CCCCCC" w:sz="1"/>
+              <w:right w:val="single" w:color="CCCCCC" w:sz="1"/>
+            </w:tcBorders>
+            <w:tcMar>
+              <w:top w:type="dxa" w:w="60"/>
+              <w:left w:type="dxa" w:w="100"/>
+              <w:bottom w:type="dxa" w:w="60"/>
+              <w:right w:type="dxa" w:w="100"/>
+            </w:tcMar>
+          </w:tcPr>
+          <w:p>
+            <w:r>
+              <w:rPr>
+                <w:rFonts w:ascii="Arial" w:cs="Arial" w:eastAsia="Arial" w:hAnsi="Arial"/>
+                <w:b/>
+                <w:bCs/>
+                <w:color w:val="333333"/>
+                <w:sz w:val="20"/>
+                <w:szCs w:val="20"/>
+              </w:rPr>
+              <w:t xml:space="preserve">Mobil</w:t>
+            </w:r>
+          </w:p>
+        </w:tc>
+        <w:tc>
+          <w:tcPr>
+            <w:tcW w:type="dxa" w:w="3373"/>
+            <w:tcBorders>
+              <w:top w:val="single" w:color="CCCCCC" w:sz="1"/>
+              <w:left w:val="single" w:color="CCCCCC" w:sz="1"/>
+              <w:bottom w:val="single" w:color="CCCCCC" w:sz="1"/>
+              <w:right w:val="single" w:color="CCCCCC" w:sz="1"/>
+            </w:tcBorders>
+            <w:tcMar>
+              <w:top w:type="dxa" w:w="60"/>
+              <w:left w:type="dxa" w:w="100"/>
+              <w:bottom w:type="dxa" w:w="60"/>
+              <w:right w:type="dxa" w:w="100"/>
+            </w:tcMar>
+          </w:tcPr>
+          <w:p>
+            <w:r>
+              <w:rPr>
+                <w:rFonts w:ascii="Arial" w:cs="Arial" w:eastAsia="Arial" w:hAnsi="Arial"/>
+                <w:color w:val="333333"/>
+                <w:sz w:val="20"/>
+                <w:szCs w:val="20"/>
+              </w:rPr>
+              <w:t xml:space="preserve">Mobilnummer</w:t>
+            </w:r>
+          </w:p>
+        </w:tc>
+        <w:tc>
+          <w:tcPr>
+            <w:tcW w:type="dxa" w:w="3856"/>
+            <w:tcBorders>
+              <w:top w:val="single" w:color="CCCCCC" w:sz="1"/>
+              <w:left w:val="single" w:color="CCCCCC" w:sz="1"/>
+              <w:bottom w:val="single" w:color="CCCCCC" w:sz="1"/>
+              <w:right w:val="single" w:color="CCCCCC" w:sz="1"/>
+            </w:tcBorders>
+            <w:tcMar>
+              <w:top w:type="dxa" w:w="60"/>
+              <w:left w:type="dxa" w:w="100"/>
+              <w:bottom w:type="dxa" w:w="60"/>
+              <w:right w:type="dxa" w:w="100"/>
+            </w:tcMar>
+          </w:tcPr>
+          <w:p>
+            <w:r>
+              <w:rPr>
+                <w:rFonts w:ascii="Arial" w:cs="Arial" w:eastAsia="Arial" w:hAnsi="Arial"/>
+                <w:color w:val="333333"/>
+                <w:sz w:val="20"/>
+                <w:szCs w:val="20"/>
+              </w:rPr>
+              <w:t xml:space="preserve">Nein</w:t>
+            </w:r>
+          </w:p>
+        </w:tc>
+      </w:tr>
+      <w:tr>
+        <w:tc>
+          <w:tcPr>
+            <w:tcW w:type="dxa" w:w="2409"/>
+            <w:tcBorders>
+              <w:top w:val="single" w:color="CCCCCC" w:sz="1"/>
+              <w:left w:val="single" w:color="CCCCCC" w:sz="1"/>
+              <w:bottom w:val="single" w:color="CCCCCC" w:sz="1"/>
+              <w:right w:val="single" w:color="CCCCCC" w:sz="1"/>
+            </w:tcBorders>
+            <w:tcMar>
+              <w:top w:type="dxa" w:w="60"/>
+              <w:left w:type="dxa" w:w="100"/>
+              <w:bottom w:type="dxa" w:w="60"/>
+              <w:right w:type="dxa" w:w="100"/>
+            </w:tcMar>
+          </w:tcPr>
+          <w:p>
+            <w:r>
+              <w:rPr>
+                <w:rFonts w:ascii="Arial" w:cs="Arial" w:eastAsia="Arial" w:hAnsi="Arial"/>
+                <w:b/>
+                <w:bCs/>
+                <w:color w:val="333333"/>
+                <w:sz w:val="20"/>
+                <w:szCs w:val="20"/>
+              </w:rPr>
+              <w:t xml:space="preserve">Email</w:t>
+            </w:r>
+          </w:p>
+        </w:tc>
+        <w:tc>
+          <w:tcPr>
+            <w:tcW w:type="dxa" w:w="3373"/>
+            <w:tcBorders>
+              <w:top w:val="single" w:color="CCCCCC" w:sz="1"/>
+              <w:left w:val="single" w:color="CCCCCC" w:sz="1"/>
+              <w:bottom w:val="single" w:color="CCCCCC" w:sz="1"/>
+              <w:right w:val="single" w:color="CCCCCC" w:sz="1"/>
+            </w:tcBorders>
+            <w:tcMar>
+              <w:top w:type="dxa" w:w="60"/>
+              <w:left w:type="dxa" w:w="100"/>
+              <w:bottom w:type="dxa" w:w="60"/>
+              <w:right w:type="dxa" w:w="100"/>
+            </w:tcMar>
+          </w:tcPr>
+          <w:p>
+            <w:r>
+              <w:rPr>
+                <w:rFonts w:ascii="Arial" w:cs="Arial" w:eastAsia="Arial" w:hAnsi="Arial"/>
+                <w:color w:val="333333"/>
+                <w:sz w:val="20"/>
+                <w:szCs w:val="20"/>
+              </w:rPr>
+              <w:t xml:space="preserve">E-Mail-Adresse</w:t>
+            </w:r>
+          </w:p>
+        </w:tc>
+        <w:tc>
+          <w:tcPr>
+            <w:tcW w:type="dxa" w:w="3856"/>
+            <w:tcBorders>
+              <w:top w:val="single" w:color="CCCCCC" w:sz="1"/>
+              <w:left w:val="single" w:color="CCCCCC" w:sz="1"/>
+              <w:bottom w:val="single" w:color="CCCCCC" w:sz="1"/>
+              <w:right w:val="single" w:color="CCCCCC" w:sz="1"/>
+            </w:tcBorders>
+            <w:tcMar>
+              <w:top w:type="dxa" w:w="60"/>
+              <w:left w:type="dxa" w:w="100"/>
+              <w:bottom w:type="dxa" w:w="60"/>
+              <w:right w:type="dxa" w:w="100"/>
+            </w:tcMar>
+          </w:tcPr>
+          <w:p>
+            <w:r>
+              <w:rPr>
+                <w:rFonts w:ascii="Arial" w:cs="Arial" w:eastAsia="Arial" w:hAnsi="Arial"/>
+                <w:color w:val="333333"/>
+                <w:sz w:val="20"/>
+                <w:szCs w:val="20"/>
+              </w:rPr>
+              <w:t xml:space="preserve">Nein</w:t>
+            </w:r>
+          </w:p>
+        </w:tc>
+      </w:tr>
+    </w:tbl>
+    <w:p>
+      <w:pPr>
+        <w:spacing w:after="120"/>
+      </w:pPr>
+      <w:r>
+        <w:rPr>
+          <w:rFonts w:ascii="Arial" w:cs="Arial" w:eastAsia="Arial" w:hAnsi="Arial"/>
+          <w:i/>
+          <w:iCs/>
+          <w:color w:val="333333"/>
+          <w:sz w:val="20"/>
+          <w:szCs w:val="20"/>
+        </w:rPr>
+        <w:t xml:space="preserve">Ablauf: Wir legen zuerst den Kunden an (Type 1, WebKontenImport), dann die zugehörigen Ansprechpartner (Type 7, WebKontakteImport) mit Verweis auf die Kundennummer.</w:t>
+      </w:r>
+    </w:p>
+    <w:p>
+      <w:pPr>
+        <w:pStyle w:val="Heading2"/>
+        <w:spacing w:after="160" w:before="280"/>
+      </w:pPr>
+      <w:r>
+        <w:rPr>
+          <w:rFonts w:ascii="Arial" w:cs="Arial" w:eastAsia="Arial" w:hAnsi="Arial"/>
+          <w:b/>
+          <w:bCs/>
+          <w:color w:val="2E75B6"/>
+          <w:sz w:val="24"/>
+          <w:szCs w:val="24"/>
+        </w:rPr>
+        <w:t xml:space="preserve">3.7 WebBelegExport (Type 30) — Belege lesen</w:t>
       </w:r>
     </w:p>
     <w:p>
@@ -7843,7 +9065,7 @@
           <w:sz w:val="24"/>
           <w:szCs w:val="24"/>
         </w:rPr>
-        <w:t xml:space="preserve">3.7 WebBelegImport (Type 30) — Belege/Rechnungen erstellen</w:t>
+        <w:t xml:space="preserve">3.8 WebBelegImport (Type 30) — Belege/Rechnungen erstellen</w:t>
       </w:r>
     </w:p>
     <w:p>
@@ -9289,347 +10511,18 @@
     </w:p>
     <w:p>
       <w:pPr>
-        <w:pStyle w:val="Heading1"/>
-        <w:spacing w:after="200" w:before="360"/>
-      </w:pPr>
-      <w:r>
-        <w:rPr>
-          <w:rFonts w:ascii="Arial" w:cs="Arial" w:eastAsia="Arial" w:hAnsi="Arial"/>
-          <w:b/>
-          <w:bCs/>
-          <w:color w:val="1F4E79"/>
-          <w:sz w:val="28"/>
-          <w:szCs w:val="28"/>
-        </w:rPr>
-        <w:t xml:space="preserve">5. Prioritäten</w:t>
-      </w:r>
-    </w:p>
-    <w:p>
-      <w:pPr>
         <w:spacing w:after="120"/>
-      </w:pPr>
-      <w:r>
-        <w:rPr>
-          <w:rFonts w:ascii="Arial" w:cs="Arial" w:eastAsia="Arial" w:hAnsi="Arial"/>
-          <w:color w:val="333333"/>
-          <w:sz w:val="20"/>
-          <w:szCs w:val="20"/>
-        </w:rPr>
-        <w:t xml:space="preserve">Folgende Reihenfolge wäre für uns ideal:</w:t>
-      </w:r>
-    </w:p>
-    <w:p>
-      <w:pPr>
-        <w:pStyle w:val="ListParagraph"/>
-        <w:numPr>
-          <w:ilvl w:val="0"/>
-          <w:numId w:val="3"/>
-        </w:numPr>
-        <w:spacing w:after="80"/>
-      </w:pPr>
-      <w:r>
-        <w:rPr>
-          <w:rFonts w:ascii="Arial" w:cs="Arial" w:eastAsia="Arial" w:hAnsi="Arial"/>
-          <w:b/>
-          <w:bCs/>
-          <w:color w:val="C0392B"/>
-          <w:sz w:val="20"/>
-          <w:szCs w:val="20"/>
-        </w:rPr>
-        <w:t xml:space="preserve">DRINGEND: </w:t>
-      </w:r>
-      <w:r>
-        <w:rPr>
-          <w:rFonts w:ascii="Arial" w:cs="Arial" w:eastAsia="Arial" w:hAnsi="Arial"/>
-          <w:sz w:val="20"/>
-          <w:szCs w:val="20"/>
-        </w:rPr>
-        <w:t xml:space="preserve">WebKontenImport (Type 1) reparieren — Kunden-Anlage ist aktuell blockiert</w:t>
-      </w:r>
-    </w:p>
-    <w:p>
-      <w:pPr>
-        <w:pStyle w:val="ListParagraph"/>
-        <w:numPr>
-          <w:ilvl w:val="0"/>
-          <w:numId w:val="3"/>
-        </w:numPr>
-        <w:spacing w:after="80"/>
-      </w:pPr>
-      <w:r>
-        <w:rPr>
-          <w:rFonts w:ascii="Arial" w:cs="Arial" w:eastAsia="Arial" w:hAnsi="Arial"/>
-          <w:b/>
-          <w:bCs/>
-          <w:color w:val="C0392B"/>
-          <w:sz w:val="20"/>
-          <w:szCs w:val="20"/>
-        </w:rPr>
-        <w:t xml:space="preserve">DRINGEND: </w:t>
-      </w:r>
-      <w:r>
-        <w:rPr>
-          <w:rFonts w:ascii="Arial" w:cs="Arial" w:eastAsia="Arial" w:hAnsi="Arial"/>
-          <w:sz w:val="20"/>
-          <w:szCs w:val="20"/>
-        </w:rPr>
-        <w:t xml:space="preserve">WebPreisExport (Type 5) neu anlegen — ohne Preise können wir keine Angebote kalkulieren</w:t>
-      </w:r>
-    </w:p>
-    <w:p>
-      <w:pPr>
-        <w:pStyle w:val="ListParagraph"/>
-        <w:numPr>
-          <w:ilvl w:val="0"/>
-          <w:numId w:val="3"/>
-        </w:numPr>
-        <w:spacing w:after="80"/>
-      </w:pPr>
-      <w:r>
-        <w:rPr>
-          <w:rFonts w:ascii="Arial" w:cs="Arial" w:eastAsia="Arial" w:hAnsi="Arial"/>
-          <w:b/>
-          <w:bCs/>
-          <w:color w:val="B7950B"/>
-          <w:sz w:val="20"/>
-          <w:szCs w:val="20"/>
-        </w:rPr>
-        <w:t xml:space="preserve">WICHTIG: </w:t>
-      </w:r>
-      <w:r>
-        <w:rPr>
-          <w:rFonts w:ascii="Arial" w:cs="Arial" w:eastAsia="Arial" w:hAnsi="Arial"/>
-          <w:sz w:val="20"/>
-          <w:szCs w:val="20"/>
-        </w:rPr>
-        <w:t xml:space="preserve">WebArtikelExport (Type 4) — zusätzliche Felder hinzufügen (Einheit, EAN, Lieferant)</w:t>
-      </w:r>
-    </w:p>
-    <w:p>
-      <w:pPr>
-        <w:pStyle w:val="ListParagraph"/>
-        <w:numPr>
-          <w:ilvl w:val="0"/>
-          <w:numId w:val="3"/>
-        </w:numPr>
-        <w:spacing w:after="80"/>
-      </w:pPr>
-      <w:r>
-        <w:rPr>
-          <w:rFonts w:ascii="Arial" w:cs="Arial" w:eastAsia="Arial" w:hAnsi="Arial"/>
-          <w:b/>
-          <w:bCs/>
-          <w:color w:val="B7950B"/>
-          <w:sz w:val="20"/>
-          <w:szCs w:val="20"/>
-        </w:rPr>
-        <w:t xml:space="preserve">WICHTIG: </w:t>
-      </w:r>
-      <w:r>
-        <w:rPr>
-          <w:rFonts w:ascii="Arial" w:cs="Arial" w:eastAsia="Arial" w:hAnsi="Arial"/>
-          <w:sz w:val="20"/>
-          <w:szCs w:val="20"/>
-        </w:rPr>
-        <w:t xml:space="preserve">WebBelegImport (Type 30) testen und ggf. konfigurieren — Rechnungserstellung aus Ticket-System</w:t>
-      </w:r>
-    </w:p>
-    <w:p>
-      <w:pPr>
-        <w:pStyle w:val="ListParagraph"/>
-        <w:numPr>
-          <w:ilvl w:val="0"/>
-          <w:numId w:val="3"/>
-        </w:numPr>
-        <w:spacing w:after="80"/>
-      </w:pPr>
-      <w:r>
-        <w:rPr>
-          <w:rFonts w:ascii="Arial" w:cs="Arial" w:eastAsia="Arial" w:hAnsi="Arial"/>
-          <w:b/>
-          <w:bCs/>
-          <w:color w:val="2471A3"/>
-          <w:sz w:val="20"/>
-          <w:szCs w:val="20"/>
-        </w:rPr>
-        <w:t xml:space="preserve">NORMAL: </w:t>
-      </w:r>
-      <w:r>
-        <w:rPr>
-          <w:rFonts w:ascii="Arial" w:cs="Arial" w:eastAsia="Arial" w:hAnsi="Arial"/>
-          <w:sz w:val="20"/>
-          <w:szCs w:val="20"/>
-        </w:rPr>
-        <w:t xml:space="preserve">WebBelegExport (Type 30) testen — Belege pro Kunde anzeigen</w:t>
-      </w:r>
-    </w:p>
-    <w:p>
-      <w:pPr>
-        <w:pStyle w:val="ListParagraph"/>
-        <w:numPr>
-          <w:ilvl w:val="0"/>
-          <w:numId w:val="3"/>
-        </w:numPr>
-        <w:spacing w:after="80"/>
-      </w:pPr>
-      <w:r>
-        <w:rPr>
-          <w:rFonts w:ascii="Arial" w:cs="Arial" w:eastAsia="Arial" w:hAnsi="Arial"/>
-          <w:b/>
-          <w:bCs/>
-          <w:color w:val="2471A3"/>
-          <w:sz w:val="20"/>
-          <w:szCs w:val="20"/>
-        </w:rPr>
-        <w:t xml:space="preserve">NORMAL: </w:t>
-      </w:r>
-      <w:r>
-        <w:rPr>
-          <w:rFonts w:ascii="Arial" w:cs="Arial" w:eastAsia="Arial" w:hAnsi="Arial"/>
-          <w:sz w:val="20"/>
-          <w:szCs w:val="20"/>
-        </w:rPr>
-        <w:t xml:space="preserve">WebKontakteExport (Type 7) testen — Kontaktpersonen pro Kunde</w:t>
-      </w:r>
-    </w:p>
-    <w:p>
-      <w:pPr>
-        <w:pStyle w:val="ListParagraph"/>
-        <w:numPr>
-          <w:ilvl w:val="0"/>
-          <w:numId w:val="3"/>
-        </w:numPr>
-        <w:spacing w:after="80"/>
-      </w:pPr>
-      <w:r>
-        <w:rPr>
-          <w:rFonts w:ascii="Arial" w:cs="Arial" w:eastAsia="Arial" w:hAnsi="Arial"/>
-          <w:b/>
-          <w:bCs/>
-          <w:color w:val="2471A3"/>
-          <w:sz w:val="20"/>
-          <w:szCs w:val="20"/>
-        </w:rPr>
-        <w:t xml:space="preserve">NORMAL: </w:t>
-      </w:r>
-      <w:r>
-        <w:rPr>
-          <w:rFonts w:ascii="Arial" w:cs="Arial" w:eastAsia="Arial" w:hAnsi="Arial"/>
-          <w:sz w:val="20"/>
-          <w:szCs w:val="20"/>
-        </w:rPr>
-        <w:t xml:space="preserve">WebKontenExport (Type 1) — zusätzliche Felder (Mobiltelefon, Kundengruppe, Zahlungsbedingung)</w:t>
-      </w:r>
-    </w:p>
-    <w:p>
-      <w:pPr>
-        <w:spacing w:after="200" w:before="400"/>
-      </w:pPr>
-    </w:p>
-    <w:p>
-      <w:pPr>
-        <w:pStyle w:val="Heading1"/>
-        <w:spacing w:after="200" w:before="360"/>
-      </w:pPr>
-      <w:r>
-        <w:rPr>
-          <w:rFonts w:ascii="Arial" w:cs="Arial" w:eastAsia="Arial" w:hAnsi="Arial"/>
-          <w:b/>
-          <w:bCs/>
-          <w:color w:val="1F4E79"/>
-          <w:sz w:val="28"/>
-          <w:szCs w:val="28"/>
-        </w:rPr>
-        <w:t xml:space="preserve">6. Kontakt</w:t>
-      </w:r>
-    </w:p>
-    <w:p>
-      <w:pPr>
-        <w:spacing w:after="120"/>
-      </w:pPr>
-      <w:r>
-        <w:rPr>
-          <w:rFonts w:ascii="Arial" w:cs="Arial" w:eastAsia="Arial" w:hAnsi="Arial"/>
-          <w:color w:val="333333"/>
-          <w:sz w:val="20"/>
-          <w:szCs w:val="20"/>
-        </w:rPr>
-        <w:t xml:space="preserve">Bei Rückfragen stehe ich jederzeit zur Verfügung:</w:t>
-      </w:r>
-    </w:p>
-    <w:p>
-      <w:pPr>
-        <w:spacing w:after="0"/>
-      </w:pPr>
-    </w:p>
-    <w:p>
-      <w:pPr>
-        <w:pStyle w:val="ListParagraph"/>
-        <w:numPr>
-          <w:ilvl w:val="0"/>
-          <w:numId w:val="2"/>
-        </w:numPr>
-        <w:spacing w:after="60"/>
-      </w:pPr>
-      <w:r>
-        <w:rPr>
-          <w:rFonts w:ascii="Arial" w:cs="Arial" w:eastAsia="Arial" w:hAnsi="Arial"/>
-          <w:sz w:val="20"/>
-          <w:szCs w:val="20"/>
-        </w:rPr>
-        <w:t xml:space="preserve">Georg Kitz — kg@kitz.co.at — +43 463 50 01 01</w:t>
-      </w:r>
-    </w:p>
-    <w:p>
-      <w:pPr>
-        <w:pStyle w:val="ListParagraph"/>
-        <w:numPr>
-          <w:ilvl w:val="0"/>
-          <w:numId w:val="2"/>
-        </w:numPr>
-        <w:spacing w:after="60"/>
-      </w:pPr>
-      <w:r>
-        <w:rPr>
-          <w:rFonts w:ascii="Arial" w:cs="Arial" w:eastAsia="Arial" w:hAnsi="Arial"/>
-          <w:sz w:val="20"/>
-          <w:szCs w:val="20"/>
-        </w:rPr>
-        <w:t xml:space="preserve">KITZ Computer + Office GmbH</w:t>
-      </w:r>
-    </w:p>
-    <w:p>
-      <w:pPr>
-        <w:pStyle w:val="ListParagraph"/>
-        <w:numPr>
-          <w:ilvl w:val="0"/>
-          <w:numId w:val="2"/>
-        </w:numPr>
-        <w:spacing w:after="60"/>
-      </w:pPr>
-      <w:r>
-        <w:rPr>
-          <w:rFonts w:ascii="Arial" w:cs="Arial" w:eastAsia="Arial" w:hAnsi="Arial"/>
-          <w:sz w:val="20"/>
-          <w:szCs w:val="20"/>
-        </w:rPr>
-        <w:t xml:space="preserve">Klagenfurt / Wolfsberg</w:t>
-      </w:r>
-    </w:p>
-    <w:p>
-      <w:pPr>
-        <w:spacing w:after="100" w:before="200"/>
       </w:pPr>
       <w:r>
         <w:rPr>
           <w:rFonts w:ascii="Arial" w:cs="Arial" w:eastAsia="Arial" w:hAnsi="Arial"/>
           <w:i/>
           <w:iCs/>
-          <w:color w:val="555555"/>
+          <w:color w:val="333333"/>
           <w:sz w:val="20"/>
           <w:szCs w:val="20"/>
         </w:rPr>
-        <w:t xml:space="preserve">Idealerweise können wir einen Termin für eine gemeinsame Test-Session vereinbaren, bei der wir die Vorlagen live testen können.</w:t>
+        <w:t xml:space="preserve">Alle aufgeführten Vorlagen werden dringend benötigt. Idealerweise können wir einen Termin für eine gemeinsame Test-Session vereinbaren, bei der wir die Vorlagen live testen können.</w:t>
       </w:r>
     </w:p>
     <w:sectPr>
@@ -9915,12 +10808,6 @@
       <w:startOverride w:val="1"/>
     </w:lvlOverride>
   </w:num>
-  <w:num w:numId="3">
-    <w:abstractNumId w:val="3"/>
-    <w:lvlOverride w:ilvl="0">
-      <w:startOverride w:val="1"/>
-    </w:lvlOverride>
-  </w:num>
 </w:numbering>
 </file>
 

</xml_diff>